<commit_message>
SITE v0.9 safe privacy remediation
</commit_message>
<xml_diff>
--- a/docs/Website_ProjectPlan_v1.0.docx
+++ b/docs/Website_ProjectPlan_v1.0.docx
@@ -61,7 +61,7 @@
           <w:sz w:val="22"/>
           <w:szCs w:val="22"/>
         </w:rPr>
-        <w:t xml:space="preserve">June 2026  ·  Owner: Nicholas  ·  Project Code: SITE</w:t>
+        <w:t xml:space="preserve">June 2026  ·  Owner: iTryKetchup Studio  ·  Project Code: SITE</w:t>
       </w:r>
     </w:p>
     <w:p>
@@ -832,7 +832,7 @@
           <w:sz w:val="20"/>
           <w:szCs w:val="20"/>
         </w:rPr>
-        <w:t xml:space="preserve">C:\Projects\Websites\itryketchup-hub\</w:t>
+        <w:t xml:space="preserve">Project repository root</w:t>
       </w:r>
     </w:p>
     <w:p>
@@ -8892,7 +8892,7 @@
                 <w:b w:val="false"/>
                 <w:bCs w:val="false"/>
               </w:rPr>
-              <w:t xml:space="preserve">Nicholas</w:t>
+              <w:t xml:space="preserve">iTryKetchup Studio</w:t>
             </w:r>
           </w:p>
         </w:tc>
@@ -9106,7 +9106,7 @@
           <w:sz w:val="18"/>
           <w:szCs w:val="18"/>
         </w:rPr>
-        <w:t xml:space="preserve">C:\Projects\Websites\itryketchup-hub\docs\Website_ProjectPlan_v1.0.docx</w:t>
+        <w:t xml:space="preserve">docs\Website_ProjectPlan_v1.0.docx</w:t>
       </w:r>
     </w:p>
     <w:p>

</xml_diff>